<commit_message>
Beginner onboarding, small content fixes, AI label and R4 prompt template
- Homepage: one-line WorkBuddy intro, install-and-login step, FAQ section
- 01: hands-on first task before concepts; plain-language code execution row
- R4: follow-up prompts become checklist + template; author's run folded
- Build: fold "作者原文示例" blocks into <details>
- Small fixes in R1/R3/R4/R6/P2/P3/P7/P8/P9 from the accuracy review
- Patient sheet emergency box synced to PDF and Word
- Digital-human video: persistent "AI 生成内容" label; records updated
- 待补清单 trimmed to human-only items; add draft fact cards G01–G08

Co-Authored-By: Claude Opus 5.5 <noreply@anthropic.com>
</commit_message>
<xml_diff>
--- a/WorkBuddy教程/成果/患教材料/家庭血压患教单_A4.docx
+++ b/WorkBuddy教程/成果/患教材料/家庭血压患教单_A4.docx
@@ -592,6 +592,83 @@
         <w:t>；用药调整先和医生商量。</w:t>
       </w:r>
     </w:p>
+    <w:tbl>
+      <w:tblPr>
+        <w:tblW w:type="auto" w:w="0"/>
+        <w:tblLook w:firstColumn="1" w:firstRow="1" w:lastColumn="0" w:lastRow="0" w:noHBand="0" w:noVBand="1" w:val="04A0"/>
+        <w:tblBorders>
+          <w:top w:val="single" w:sz="12" w:color="000000"/>
+          <w:left w:val="single" w:sz="12" w:color="000000"/>
+          <w:bottom w:val="single" w:sz="12" w:color="000000"/>
+          <w:right w:val="single" w:sz="12" w:color="000000"/>
+        </w:tblBorders>
+        <w:tblW w:w="5000" w:type="pct"/>
+      </w:tblPr>
+      <w:tblGrid>
+        <w:gridCol w:w="10318"/>
+      </w:tblGrid>
+      <w:tr>
+        <w:tc>
+          <w:tcPr>
+            <w:tcW w:type="dxa" w:w="10318"/>
+          </w:tcPr>
+          <w:p>
+            <w:pPr>
+              <w:spacing w:after="40"/>
+            </w:pPr>
+            <w:r>
+              <w:rPr>
+                <w:rFonts w:ascii="Songti SC" w:hAnsi="Songti SC" w:eastAsia="Songti SC" w:cs="Songti SC"/>
+                <w:b/>
+                <w:sz w:val="28"/>
+              </w:rPr>
+              <w:t>出现以下情况，请立即就医或拨打 120</w:t>
+            </w:r>
+            <w:r>
+              <w:rPr>
+                <w:rFonts w:ascii="Songti SC" w:hAnsi="Songti SC" w:eastAsia="Songti SC" w:cs="Songti SC"/>
+                <w:b w:val="0"/>
+                <w:sz w:val="28"/>
+              </w:rPr>
+              <w:t>（由医生填写并签字）：</w:t>
+            </w:r>
+          </w:p>
+          <w:p>
+            <w:pPr>
+              <w:spacing w:after="0"/>
+              <w:pBdr>
+                <w:bottom w:val="single" w:sz="6" w:color="000000"/>
+              </w:pBdr>
+            </w:pPr>
+            <w:r>
+              <w:rPr>
+                <w:rFonts w:ascii="Songti SC" w:hAnsi="Songti SC" w:eastAsia="Songti SC" w:cs="Songti SC"/>
+                <w:b w:val="0"/>
+                <w:sz w:val="28"/>
+              </w:rPr>
+              <w:t xml:space="preserve"> </w:t>
+            </w:r>
+          </w:p>
+          <w:p>
+            <w:pPr>
+              <w:spacing w:after="0"/>
+              <w:pBdr>
+                <w:bottom w:val="single" w:sz="6" w:color="000000"/>
+              </w:pBdr>
+            </w:pPr>
+            <w:r>
+              <w:rPr>
+                <w:rFonts w:ascii="Songti SC" w:hAnsi="Songti SC" w:eastAsia="Songti SC" w:cs="Songti SC"/>
+                <w:b w:val="0"/>
+                <w:sz w:val="28"/>
+              </w:rPr>
+              <w:t xml:space="preserve"> </w:t>
+            </w:r>
+          </w:p>
+        </w:tc>
+      </w:tr>
+    </w:tbl>
+    <w:p/>
     <w:tbl>
       <w:tblPr>
         <w:tblW w:w="8306" w:type="dxa"/>

</xml_diff>